<commit_message>
commit on 28 mar
</commit_message>
<xml_diff>
--- a/Meeting Minutes.docx
+++ b/Meeting Minutes.docx
@@ -2028,15 +2028,7 @@
           <w:sz w:val="22"/>
           <w:szCs w:val="22"/>
         </w:rPr>
-        <w:t>T</w:t>
-      </w:r>
-      <w:r>
-        <w:rPr>
-          <w:rFonts w:ascii="Calibri" w:hAnsi="Calibri" w:cs="Calibri"/>
-          <w:sz w:val="22"/>
-          <w:szCs w:val="22"/>
-        </w:rPr>
-        <w:t>he project was flagged as high risk due to mismatches between the dataset and analytical methods used.</w:t>
+        <w:t>The project was flagged as high risk due to mismatches between the dataset and analytical methods used.</w:t>
       </w:r>
     </w:p>
     <w:p>
@@ -6102,6 +6094,7 @@
   <w:style w:type="character" w:default="1" w:styleId="DefaultParagraphFont">
     <w:name w:val="Default Paragraph Font"/>
     <w:uiPriority w:val="1"/>
+    <w:semiHidden/>
     <w:unhideWhenUsed/>
   </w:style>
   <w:style w:type="table" w:default="1" w:styleId="TableNormal">

</xml_diff>